<commit_message>
Update CPM coauthor email request packet
</commit_message>
<xml_diff>
--- a/manuscript/computational_particle_mechanics_coauthor_email_request_zh_en.docx
+++ b/manuscript/computational_particle_mechanics_coauthor_email_request_zh_en.docx
@@ -102,6 +102,22 @@
     <w:p/>
     <w:p>
       <w:r>
+        <w:t>我另外查到两条公开候选邮箱，仅供本人确认，不会在未确认前直接填入投稿系统：</w:t>
+      </w:r>
+    </w:p>
+    <w:p>
+      <w:r>
+        <w:t>- Gang Shen: shenganghit@163.com（请沈刚老师确认该邮箱是否可用于投稿系统）</w:t>
+      </w:r>
+    </w:p>
+    <w:p>
+      <w:r>
+        <w:t>- Haishun Deng: 269469122@qq.com（请邓海顺老师确认该邮箱是否可用于投稿系统）</w:t>
+      </w:r>
+    </w:p>
+    <w:p/>
+    <w:p>
+      <w:r>
         <w:t>同时请确认作者顺序、单位和贡献描述没有问题。如需查看当前记录，可参考随附的 author e-mail completion sheet。</w:t>
       </w:r>
     </w:p>
@@ -174,6 +190,22 @@
     <w:p>
       <w:r>
         <w:t>- Haishun Deng</w:t>
+      </w:r>
+    </w:p>
+    <w:p/>
+    <w:p>
+      <w:r>
+        <w:t>Two public candidate e-mail records have been found for confirmation only. They will not be entered into the submission system before author confirmation:</w:t>
+      </w:r>
+    </w:p>
+    <w:p>
+      <w:r>
+        <w:t>- Gang Shen: shenganghit@163.com (Please confirm whether this e-mail may be used in the submission system.)</w:t>
+      </w:r>
+    </w:p>
+    <w:p>
+      <w:r>
+        <w:t>- Haishun Deng: 269469122@qq.com (Please confirm whether this e-mail may be used in the submission system.)</w:t>
       </w:r>
     </w:p>
     <w:p/>

</xml_diff>

<commit_message>
Add CPM coauthor email candidates and NAS status
</commit_message>
<xml_diff>
--- a/manuscript/computational_particle_mechanics_coauthor_email_request_zh_en.docx
+++ b/manuscript/computational_particle_mechanics_coauthor_email_request_zh_en.docx
@@ -102,7 +102,17 @@
     <w:p/>
     <w:p>
       <w:r>
-        <w:t>我另外查到两条公开候选邮箱，仅供本人确认，不会在未确认前直接填入投稿系统：</w:t>
+        <w:t>我另外查到四条公开候选邮箱，仅供本人确认，不会在未确认前直接填入投稿系统：</w:t>
+      </w:r>
+    </w:p>
+    <w:p>
+      <w:r>
+        <w:t>- Ming-Zhun Lei: leimz@ipp.ac.cn（请雷明准老师确认该邮箱是否可用于投稿系统）</w:t>
+      </w:r>
+    </w:p>
+    <w:p>
+      <w:r>
+        <w:t>- Wei Wen: wenwei@ipp.ac.cn（请文伟老师确认该邮箱是否可用于投稿系统）</w:t>
       </w:r>
     </w:p>
     <w:p>
@@ -195,7 +205,17 @@
     <w:p/>
     <w:p>
       <w:r>
-        <w:t>Two public candidate e-mail records have been found for confirmation only. They will not be entered into the submission system before author confirmation:</w:t>
+        <w:t>Four public candidate e-mail records have been found for confirmation only. They will not be entered into the submission system before author confirmation:</w:t>
+      </w:r>
+    </w:p>
+    <w:p>
+      <w:r>
+        <w:t>- Ming-Zhun Lei: leimz@ipp.ac.cn (Please confirm whether this e-mail may be used in the submission system.)</w:t>
+      </w:r>
+    </w:p>
+    <w:p>
+      <w:r>
+        <w:t>- Wei Wen: wenwei@ipp.ac.cn (Please confirm whether this e-mail may be used in the submission system.)</w:t>
       </w:r>
     </w:p>
     <w:p>

</xml_diff>